<commit_message>
feat(release): update 4-stage competition structure, streamline evaluation, add candidate support and handbook v4
- Restructure journey into 4 official stages (remove Stage 4 Technical Round 17/10, merge into Finale 31/10)
- Remove Stage 1 video requirement and proposal questions
- Streamline EvaluationSection by removing detailed scoring rubric, percentage weights, and formula
- Add dedicated Candidate Support and Handbook V4 cards pointing to official Zalo support group and downloadable docx
- Polish Vietnamese copy, retain standard technical terms (Trace log, System Prompt, Temperature, Harness Engineering, Git Diff)
- Register motion-design skill with smooth CSS Grid accordion expansions and natural easing curves
- Pass 100% 52 unit/parity tests, 0 typecheck, 0 lint, build static export
</commit_message>
<xml_diff>
--- a/public/docs/So_tay_thi_sinh_AI-for-Impact-2026_V4.docx
+++ b/public/docs/So_tay_thi_sinh_AI-for-Impact-2026_V4.docx
@@ -943,7 +943,16 @@
                 <w:sz w:val="24"/>
                 <w:szCs w:val="24"/>
               </w:rPr>
-              <w:t>Vòng Kỹ thuật (17/10)</w:t>
+              <w:t>Vòng trình bày ý tưởng</w:t>
+            </w:r>
+            <w:r>
+              <w:rPr>
+                <w:b/>
+                <w:bCs/>
+                <w:sz w:val="24"/>
+                <w:szCs w:val="24"/>
+              </w:rPr>
+              <w:t xml:space="preserve"> (17/10)</w:t>
             </w:r>
           </w:p>
         </w:tc>
@@ -1030,7 +1039,7 @@
                 <w:sz w:val="24"/>
                 <w:szCs w:val="24"/>
               </w:rPr>
-              <w:t>Chung cho mọi đội: Agent hỗ trợ sinh viên tra quy chế và xử lý ticket.</w:t>
+              <w:t xml:space="preserve">Mỗi đội sẽ trình bày ý tưởng triển khai sản phẩn AI Agent </w:t>
             </w:r>
           </w:p>
         </w:tc>
@@ -1080,6 +1089,7 @@
                 <w:sz w:val="24"/>
                 <w:szCs w:val="24"/>
               </w:rPr>
+              <w:lastRenderedPageBreak/>
               <w:t>Điểm xuất phát</w:t>
             </w:r>
           </w:p>
@@ -1104,7 +1114,7 @@
                 <w:sz w:val="24"/>
                 <w:szCs w:val="24"/>
               </w:rPr>
-              <w:t>Một repository chạy được nhưng còn ít nhất 6 lỗi.</w:t>
+              <w:t>Slides + demo (nếu có) để BGK hiểu được mục tiêu của sản phẩm sẽ giải quyết bài toán gì</w:t>
             </w:r>
           </w:p>
         </w:tc>
@@ -1168,7 +1178,6 @@
                 <w:sz w:val="24"/>
                 <w:szCs w:val="24"/>
               </w:rPr>
-              <w:lastRenderedPageBreak/>
               <w:t>Việc em làm</w:t>
             </w:r>
           </w:p>
@@ -1193,7 +1202,14 @@
                 <w:sz w:val="24"/>
                 <w:szCs w:val="24"/>
               </w:rPr>
-              <w:t>Tìm lỗi, sửa lớp điều khiển quanh Agent, chứng minh bằng số liệu.</w:t>
+              <w:t>Trình bày bài toán mà nhóm sẽ giải quyết thông qua AI Agent</w:t>
+            </w:r>
+            <w:r>
+              <w:rPr>
+                <w:sz w:val="24"/>
+                <w:szCs w:val="24"/>
+              </w:rPr>
+              <w:t>.</w:t>
             </w:r>
           </w:p>
         </w:tc>
@@ -1267,7 +1283,14 @@
                 <w:sz w:val="24"/>
                 <w:szCs w:val="24"/>
               </w:rPr>
-              <w:t>01 repository đã sửa + 10 ca kiểm thử + báo cáo 06 chỉ số trước/sau.</w:t>
+              <w:t>Slide + demo</w:t>
+            </w:r>
+            <w:r>
+              <w:rPr>
+                <w:sz w:val="24"/>
+                <w:szCs w:val="24"/>
+              </w:rPr>
+              <w:t>.</w:t>
             </w:r>
           </w:p>
         </w:tc>
@@ -1341,7 +1364,7 @@
                 <w:sz w:val="24"/>
                 <w:szCs w:val="24"/>
               </w:rPr>
-              <w:t>70% máy chấm tự động, 30% hội đồng phỏng vấn kỹ thuật.</w:t>
+              <w:t xml:space="preserve">BGK chấm online qua meet </w:t>
             </w:r>
           </w:p>
         </w:tc>
@@ -1445,19 +1468,6 @@
         </w:tc>
       </w:tr>
     </w:tbl>
-    <w:p>
-      <w:pPr>
-        <w:spacing w:before="100" w:after="100" w:line="276" w:lineRule="auto"/>
-        <w:jc w:val="both"/>
-      </w:pPr>
-      <w:r>
-        <w:rPr>
-          <w:i/>
-          <w:iCs/>
-        </w:rPr>
-        <w:t>Vòng Kỹ thuật tồn tại vì một lý do rất thực tế: nếu chưa từng chữa một Agent hỏng, em sẽ không biết Agent của mình hỏng ở đâu khi tự xây.</w:t>
-      </w:r>
-    </w:p>
     <w:p>
       <w:pPr>
         <w:spacing w:before="200" w:after="100" w:line="276" w:lineRule="auto"/>
@@ -2946,7 +2956,7 @@
           <w:b/>
           <w:bCs/>
         </w:rPr>
-        <w:t>/09): 60</w:t>
+        <w:t>/09): 240</w:t>
       </w:r>
       <w:r>
         <w:rPr>
@@ -3062,7 +3072,14 @@
           <w:b/>
           <w:bCs/>
         </w:rPr>
-        <w:t>Chặng 4 (thứ Bảy 17/10): Vòng Kỹ thuật, một ngày chữa Agent</w:t>
+        <w:t xml:space="preserve">Chặng 4 (thứ Bảy 17/10): </w:t>
+      </w:r>
+      <w:r>
+        <w:rPr>
+          <w:b/>
+          <w:bCs/>
+        </w:rPr>
+        <w:t>Vòng trình bày ý tưởng</w:t>
       </w:r>
     </w:p>
     <w:p>
@@ -3070,9 +3087,6 @@
         <w:spacing w:after="100" w:line="276" w:lineRule="auto"/>
         <w:jc w:val="both"/>
       </w:pPr>
-      <w:r>
-        <w:t>Sáng hôm đó đội Đi Cùng nhận một repository. Bên trong là một Agent hỗ trợ sinh viên đã chạy được, nhưng còn hỏng. Đây là những gì đội thực sự làm, theo giờ:</w:t>
-      </w:r>
     </w:p>
     <w:tbl>
       <w:tblPr>
@@ -3209,6 +3223,13 @@
               </w:rPr>
               <w:t>08h</w:t>
             </w:r>
+            <w:r>
+              <w:rPr>
+                <w:sz w:val="24"/>
+                <w:szCs w:val="24"/>
+              </w:rPr>
+              <w:t>-11h</w:t>
+            </w:r>
           </w:p>
         </w:tc>
         <w:tc>
@@ -3231,8 +3252,10 @@
                 <w:sz w:val="24"/>
                 <w:szCs w:val="24"/>
               </w:rPr>
-              <w:t>Chạy bộ kiểm thử công khai, chụp lại màn hình điểm số.</w:t>
-            </w:r>
+              <w:t>Mỗi đội sẽ có 15p trình bày cho BGK về ý tưởng, mục tiêu và giải pháp của AI Agent</w:t>
+            </w:r>
+            <w:bookmarkStart w:id="0" w:name="_GoBack"/>
+            <w:bookmarkEnd w:id="0"/>
           </w:p>
         </w:tc>
         <w:tc>
@@ -3255,814 +3278,7 @@
                 <w:sz w:val="24"/>
                 <w:szCs w:val="24"/>
               </w:rPr>
-              <w:t>Điểm baseline 42,50/100. Chỉ 1 trên 6 ca đạt điểm tuyệt đối.</w:t>
-            </w:r>
-          </w:p>
-        </w:tc>
-      </w:tr>
-      <w:tr>
-        <w:tc>
-          <w:tcPr>
-            <w:tcW w:w="900" w:type="dxa"/>
-            <w:tcMar>
-              <w:top w:w="60" w:type="dxa"/>
-              <w:left w:w="100" w:type="dxa"/>
-              <w:bottom w:w="60" w:type="dxa"/>
-              <w:right w:w="100" w:type="dxa"/>
-            </w:tcMar>
-            <w:vAlign w:val="center"/>
-          </w:tcPr>
-          <w:p>
-            <w:pPr>
-              <w:spacing w:before="40" w:after="40" w:line="260" w:lineRule="auto"/>
-              <w:jc w:val="center"/>
-            </w:pPr>
-            <w:r>
-              <w:rPr>
-                <w:sz w:val="24"/>
-                <w:szCs w:val="24"/>
-              </w:rPr>
-              <w:t>08h10</w:t>
-            </w:r>
-          </w:p>
-        </w:tc>
-        <w:tc>
-          <w:tcPr>
-            <w:tcW w:w="4200" w:type="dxa"/>
-            <w:tcMar>
-              <w:top w:w="60" w:type="dxa"/>
-              <w:left w:w="100" w:type="dxa"/>
-              <w:bottom w:w="60" w:type="dxa"/>
-              <w:right w:w="100" w:type="dxa"/>
-            </w:tcMar>
-            <w:vAlign w:val="center"/>
-          </w:tcPr>
-          <w:p>
-            <w:pPr>
-              <w:spacing w:before="40" w:after="40" w:line="260" w:lineRule="auto"/>
-            </w:pPr>
-            <w:r>
-              <w:rPr>
-                <w:sz w:val="24"/>
-                <w:szCs w:val="24"/>
-              </w:rPr>
-              <w:t>Đọc báo cáo lỗi từng ca, liệt kê ra giấy các lỗi thấy được.</w:t>
-            </w:r>
-          </w:p>
-        </w:tc>
-        <w:tc>
-          <w:tcPr>
-            <w:tcW w:w="4254" w:type="dxa"/>
-            <w:tcMar>
-              <w:top w:w="60" w:type="dxa"/>
-              <w:left w:w="100" w:type="dxa"/>
-              <w:bottom w:w="60" w:type="dxa"/>
-              <w:right w:w="100" w:type="dxa"/>
-            </w:tcMar>
-            <w:vAlign w:val="center"/>
-          </w:tcPr>
-          <w:p>
-            <w:pPr>
-              <w:spacing w:before="40" w:after="40" w:line="260" w:lineRule="auto"/>
-            </w:pPr>
-            <w:r>
-              <w:rPr>
-                <w:sz w:val="24"/>
-                <w:szCs w:val="24"/>
-              </w:rPr>
-              <w:t>Danh sách 6 lỗi: đóng ticket khi chưa xác nhận, dùng quy định hết hạn, làm theo chỉ dẫn độc hại trong tài liệu, báo thành công khi API lỗi, không dẫn nguồn, cho xem dữ liệu người khác.</w:t>
-            </w:r>
-          </w:p>
-        </w:tc>
-      </w:tr>
-      <w:tr>
-        <w:tc>
-          <w:tcPr>
-            <w:tcW w:w="900" w:type="dxa"/>
-            <w:tcMar>
-              <w:top w:w="60" w:type="dxa"/>
-              <w:left w:w="100" w:type="dxa"/>
-              <w:bottom w:w="60" w:type="dxa"/>
-              <w:right w:w="100" w:type="dxa"/>
-            </w:tcMar>
-            <w:vAlign w:val="center"/>
-          </w:tcPr>
-          <w:p>
-            <w:pPr>
-              <w:spacing w:before="40" w:after="40" w:line="260" w:lineRule="auto"/>
-              <w:jc w:val="center"/>
-            </w:pPr>
-            <w:r>
-              <w:rPr>
-                <w:sz w:val="24"/>
-                <w:szCs w:val="24"/>
-              </w:rPr>
-              <w:t>08h20</w:t>
-            </w:r>
-          </w:p>
-        </w:tc>
-        <w:tc>
-          <w:tcPr>
-            <w:tcW w:w="4200" w:type="dxa"/>
-            <w:tcMar>
-              <w:top w:w="60" w:type="dxa"/>
-              <w:left w:w="100" w:type="dxa"/>
-              <w:bottom w:w="60" w:type="dxa"/>
-              <w:right w:w="100" w:type="dxa"/>
-            </w:tcMar>
-            <w:vAlign w:val="center"/>
-          </w:tcPr>
-          <w:p>
-            <w:pPr>
-              <w:spacing w:before="40" w:after="40" w:line="260" w:lineRule="auto"/>
-            </w:pPr>
-            <w:r>
-              <w:rPr>
-                <w:sz w:val="24"/>
-                <w:szCs w:val="24"/>
-              </w:rPr>
-              <w:t>Sửa theo thứ tự ưu tiên, bắt đầu từ quyền và bảo mật.</w:t>
-            </w:r>
-          </w:p>
-        </w:tc>
-        <w:tc>
-          <w:tcPr>
-            <w:tcW w:w="4254" w:type="dxa"/>
-            <w:tcMar>
-              <w:top w:w="60" w:type="dxa"/>
-              <w:left w:w="100" w:type="dxa"/>
-              <w:bottom w:w="60" w:type="dxa"/>
-              <w:right w:w="100" w:type="dxa"/>
-            </w:tcMar>
-            <w:vAlign w:val="center"/>
-          </w:tcPr>
-          <w:p>
-            <w:pPr>
-              <w:spacing w:before="40" w:after="40" w:line="260" w:lineRule="auto"/>
-            </w:pPr>
-            <w:r>
-              <w:rPr>
-                <w:sz w:val="24"/>
-                <w:szCs w:val="24"/>
-              </w:rPr>
-              <w:t>Ca bảo mật từ 50 lên 100 điểm.</w:t>
-            </w:r>
-          </w:p>
-        </w:tc>
-      </w:tr>
-      <w:tr>
-        <w:tc>
-          <w:tcPr>
-            <w:tcW w:w="900" w:type="dxa"/>
-            <w:tcMar>
-              <w:top w:w="60" w:type="dxa"/>
-              <w:left w:w="100" w:type="dxa"/>
-              <w:bottom w:w="60" w:type="dxa"/>
-              <w:right w:w="100" w:type="dxa"/>
-            </w:tcMar>
-            <w:vAlign w:val="center"/>
-          </w:tcPr>
-          <w:p>
-            <w:pPr>
-              <w:spacing w:before="40" w:after="40" w:line="260" w:lineRule="auto"/>
-              <w:jc w:val="center"/>
-            </w:pPr>
-            <w:r>
-              <w:rPr>
-                <w:sz w:val="24"/>
-                <w:szCs w:val="24"/>
-              </w:rPr>
-              <w:t>8h3</w:t>
-            </w:r>
-            <w:r>
-              <w:rPr>
-                <w:sz w:val="24"/>
-                <w:szCs w:val="24"/>
-              </w:rPr>
-              <w:t>0</w:t>
-            </w:r>
-          </w:p>
-        </w:tc>
-        <w:tc>
-          <w:tcPr>
-            <w:tcW w:w="4200" w:type="dxa"/>
-            <w:tcMar>
-              <w:top w:w="60" w:type="dxa"/>
-              <w:left w:w="100" w:type="dxa"/>
-              <w:bottom w:w="60" w:type="dxa"/>
-              <w:right w:w="100" w:type="dxa"/>
-            </w:tcMar>
-            <w:vAlign w:val="center"/>
-          </w:tcPr>
-          <w:p>
-            <w:pPr>
-              <w:spacing w:before="40" w:after="40" w:line="260" w:lineRule="auto"/>
-            </w:pPr>
-            <w:r>
-              <w:rPr>
-                <w:sz w:val="24"/>
-                <w:szCs w:val="24"/>
-              </w:rPr>
-              <w:t>Bắt buộc xác nhận trước khi tạo yêu cầu phúc tra.</w:t>
-            </w:r>
-          </w:p>
-        </w:tc>
-        <w:tc>
-          <w:tcPr>
-            <w:tcW w:w="4254" w:type="dxa"/>
-            <w:tcMar>
-              <w:top w:w="60" w:type="dxa"/>
-              <w:left w:w="100" w:type="dxa"/>
-              <w:bottom w:w="60" w:type="dxa"/>
-              <w:right w:w="100" w:type="dxa"/>
-            </w:tcMar>
-            <w:vAlign w:val="center"/>
-          </w:tcPr>
-          <w:p>
-            <w:pPr>
-              <w:spacing w:before="40" w:after="40" w:line="260" w:lineRule="auto"/>
-            </w:pPr>
-            <w:r>
-              <w:rPr>
-                <w:sz w:val="24"/>
-                <w:szCs w:val="24"/>
-              </w:rPr>
-              <w:t>Ca phê duyệt từ 0 lên 100 điểm.</w:t>
-            </w:r>
-          </w:p>
-        </w:tc>
-      </w:tr>
-      <w:tr>
-        <w:tc>
-          <w:tcPr>
-            <w:tcW w:w="900" w:type="dxa"/>
-            <w:tcMar>
-              <w:top w:w="60" w:type="dxa"/>
-              <w:left w:w="100" w:type="dxa"/>
-              <w:bottom w:w="60" w:type="dxa"/>
-              <w:right w:w="100" w:type="dxa"/>
-            </w:tcMar>
-            <w:vAlign w:val="center"/>
-          </w:tcPr>
-          <w:p>
-            <w:pPr>
-              <w:spacing w:before="40" w:after="40" w:line="260" w:lineRule="auto"/>
-              <w:jc w:val="center"/>
-            </w:pPr>
-            <w:r>
-              <w:rPr>
-                <w:sz w:val="24"/>
-                <w:szCs w:val="24"/>
-              </w:rPr>
-              <w:lastRenderedPageBreak/>
-              <w:t>8h4</w:t>
-            </w:r>
-            <w:r>
-              <w:rPr>
-                <w:sz w:val="24"/>
-                <w:szCs w:val="24"/>
-              </w:rPr>
-              <w:t>0</w:t>
-            </w:r>
-          </w:p>
-        </w:tc>
-        <w:tc>
-          <w:tcPr>
-            <w:tcW w:w="4200" w:type="dxa"/>
-            <w:tcMar>
-              <w:top w:w="60" w:type="dxa"/>
-              <w:left w:w="100" w:type="dxa"/>
-              <w:bottom w:w="60" w:type="dxa"/>
-              <w:right w:w="100" w:type="dxa"/>
-            </w:tcMar>
-            <w:vAlign w:val="center"/>
-          </w:tcPr>
-          <w:p>
-            <w:pPr>
-              <w:spacing w:before="40" w:after="40" w:line="260" w:lineRule="auto"/>
-            </w:pPr>
-            <w:r>
-              <w:rPr>
-                <w:sz w:val="24"/>
-                <w:szCs w:val="24"/>
-              </w:rPr>
-              <w:t>Lọc bỏ quy định hết hiệu lực, giữ mã quy định để dẫn nguồn.</w:t>
-            </w:r>
-          </w:p>
-        </w:tc>
-        <w:tc>
-          <w:tcPr>
-            <w:tcW w:w="4254" w:type="dxa"/>
-            <w:tcMar>
-              <w:top w:w="60" w:type="dxa"/>
-              <w:left w:w="100" w:type="dxa"/>
-              <w:bottom w:w="60" w:type="dxa"/>
-              <w:right w:w="100" w:type="dxa"/>
-            </w:tcMar>
-            <w:vAlign w:val="center"/>
-          </w:tcPr>
-          <w:p>
-            <w:pPr>
-              <w:spacing w:before="40" w:after="40" w:line="260" w:lineRule="auto"/>
-            </w:pPr>
-            <w:r>
-              <w:rPr>
-                <w:sz w:val="24"/>
-                <w:szCs w:val="24"/>
-              </w:rPr>
-              <w:t>Hai ca điểm danh từ 40 lên gần tuyệt đối.</w:t>
-            </w:r>
-          </w:p>
-        </w:tc>
-      </w:tr>
-      <w:tr>
-        <w:tc>
-          <w:tcPr>
-            <w:tcW w:w="900" w:type="dxa"/>
-            <w:tcMar>
-              <w:top w:w="60" w:type="dxa"/>
-              <w:left w:w="100" w:type="dxa"/>
-              <w:bottom w:w="60" w:type="dxa"/>
-              <w:right w:w="100" w:type="dxa"/>
-            </w:tcMar>
-            <w:vAlign w:val="center"/>
-          </w:tcPr>
-          <w:p>
-            <w:pPr>
-              <w:spacing w:before="40" w:after="40" w:line="260" w:lineRule="auto"/>
-              <w:jc w:val="center"/>
-            </w:pPr>
-            <w:r>
-              <w:rPr>
-                <w:sz w:val="24"/>
-                <w:szCs w:val="24"/>
-              </w:rPr>
-              <w:t>9h</w:t>
-            </w:r>
-          </w:p>
-        </w:tc>
-        <w:tc>
-          <w:tcPr>
-            <w:tcW w:w="4200" w:type="dxa"/>
-            <w:tcMar>
-              <w:top w:w="60" w:type="dxa"/>
-              <w:left w:w="100" w:type="dxa"/>
-              <w:bottom w:w="60" w:type="dxa"/>
-              <w:right w:w="100" w:type="dxa"/>
-            </w:tcMar>
-            <w:vAlign w:val="center"/>
-          </w:tcPr>
-          <w:p>
-            <w:pPr>
-              <w:spacing w:before="40" w:after="40" w:line="260" w:lineRule="auto"/>
-            </w:pPr>
-            <w:r>
-              <w:rPr>
-                <w:sz w:val="24"/>
-                <w:szCs w:val="24"/>
-              </w:rPr>
-              <w:t>Thêm cơ chế thử lại có giới hạn và chuyển cán bộ khi công cụ lỗi.</w:t>
-            </w:r>
-          </w:p>
-        </w:tc>
-        <w:tc>
-          <w:tcPr>
-            <w:tcW w:w="4254" w:type="dxa"/>
-            <w:tcMar>
-              <w:top w:w="60" w:type="dxa"/>
-              <w:left w:w="100" w:type="dxa"/>
-              <w:bottom w:w="60" w:type="dxa"/>
-              <w:right w:w="100" w:type="dxa"/>
-            </w:tcMar>
-            <w:vAlign w:val="center"/>
-          </w:tcPr>
-          <w:p>
-            <w:pPr>
-              <w:spacing w:before="40" w:after="40" w:line="260" w:lineRule="auto"/>
-            </w:pPr>
-            <w:r>
-              <w:rPr>
-                <w:sz w:val="24"/>
-                <w:szCs w:val="24"/>
-              </w:rPr>
-              <w:t>Ca timeout từ 25 lên 100 điểm.</w:t>
-            </w:r>
-          </w:p>
-        </w:tc>
-      </w:tr>
-      <w:tr>
-        <w:tc>
-          <w:tcPr>
-            <w:tcW w:w="900" w:type="dxa"/>
-            <w:tcMar>
-              <w:top w:w="60" w:type="dxa"/>
-              <w:left w:w="100" w:type="dxa"/>
-              <w:bottom w:w="60" w:type="dxa"/>
-              <w:right w:w="100" w:type="dxa"/>
-            </w:tcMar>
-            <w:vAlign w:val="center"/>
-          </w:tcPr>
-          <w:p>
-            <w:pPr>
-              <w:spacing w:before="40" w:after="40" w:line="260" w:lineRule="auto"/>
-              <w:jc w:val="center"/>
-            </w:pPr>
-            <w:r>
-              <w:rPr>
-                <w:sz w:val="24"/>
-                <w:szCs w:val="24"/>
-              </w:rPr>
-              <w:t>9h1</w:t>
-            </w:r>
-            <w:r>
-              <w:rPr>
-                <w:sz w:val="24"/>
-                <w:szCs w:val="24"/>
-              </w:rPr>
-              <w:t>0</w:t>
-            </w:r>
-          </w:p>
-        </w:tc>
-        <w:tc>
-          <w:tcPr>
-            <w:tcW w:w="4200" w:type="dxa"/>
-            <w:tcMar>
-              <w:top w:w="60" w:type="dxa"/>
-              <w:left w:w="100" w:type="dxa"/>
-              <w:bottom w:w="60" w:type="dxa"/>
-              <w:right w:w="100" w:type="dxa"/>
-            </w:tcMar>
-            <w:vAlign w:val="center"/>
-          </w:tcPr>
-          <w:p>
-            <w:pPr>
-              <w:spacing w:before="40" w:after="40" w:line="260" w:lineRule="auto"/>
-            </w:pPr>
-            <w:r>
-              <w:rPr>
-                <w:sz w:val="24"/>
-                <w:szCs w:val="24"/>
-              </w:rPr>
-              <w:t>Sau khi tạo bản ghi thì kiểm tra lại trong database rồi mới kết luận.</w:t>
-            </w:r>
-          </w:p>
-        </w:tc>
-        <w:tc>
-          <w:tcPr>
-            <w:tcW w:w="4254" w:type="dxa"/>
-            <w:tcMar>
-              <w:top w:w="60" w:type="dxa"/>
-              <w:left w:w="100" w:type="dxa"/>
-              <w:bottom w:w="60" w:type="dxa"/>
-              <w:right w:w="100" w:type="dxa"/>
-            </w:tcMar>
-            <w:vAlign w:val="center"/>
-          </w:tcPr>
-          <w:p>
-            <w:pPr>
-              <w:spacing w:before="40" w:after="40" w:line="260" w:lineRule="auto"/>
-            </w:pPr>
-            <w:r>
-              <w:rPr>
-                <w:sz w:val="24"/>
-                <w:szCs w:val="24"/>
-              </w:rPr>
-              <w:t>Agent không còn nói “đã xong” khi thật ra chưa xong.</w:t>
-            </w:r>
-          </w:p>
-        </w:tc>
-      </w:tr>
-      <w:tr>
-        <w:tc>
-          <w:tcPr>
-            <w:tcW w:w="900" w:type="dxa"/>
-            <w:tcMar>
-              <w:top w:w="60" w:type="dxa"/>
-              <w:left w:w="100" w:type="dxa"/>
-              <w:bottom w:w="60" w:type="dxa"/>
-              <w:right w:w="100" w:type="dxa"/>
-            </w:tcMar>
-            <w:vAlign w:val="center"/>
-          </w:tcPr>
-          <w:p>
-            <w:pPr>
-              <w:spacing w:before="40" w:after="40" w:line="260" w:lineRule="auto"/>
-              <w:jc w:val="center"/>
-            </w:pPr>
-            <w:r>
-              <w:rPr>
-                <w:sz w:val="24"/>
-                <w:szCs w:val="24"/>
-              </w:rPr>
-              <w:t>9h20</w:t>
-            </w:r>
-          </w:p>
-        </w:tc>
-        <w:tc>
-          <w:tcPr>
-            <w:tcW w:w="4200" w:type="dxa"/>
-            <w:tcMar>
-              <w:top w:w="60" w:type="dxa"/>
-              <w:left w:w="100" w:type="dxa"/>
-              <w:bottom w:w="60" w:type="dxa"/>
-              <w:right w:w="100" w:type="dxa"/>
-            </w:tcMar>
-            <w:vAlign w:val="center"/>
-          </w:tcPr>
-          <w:p>
-            <w:pPr>
-              <w:spacing w:before="40" w:after="40" w:line="260" w:lineRule="auto"/>
-            </w:pPr>
-            <w:r>
-              <w:rPr>
-                <w:sz w:val="24"/>
-                <w:szCs w:val="24"/>
-              </w:rPr>
-              <w:t>Viết 10 ca kiểm thử của riêng đội.</w:t>
-            </w:r>
-          </w:p>
-        </w:tc>
-        <w:tc>
-          <w:tcPr>
-            <w:tcW w:w="4254" w:type="dxa"/>
-            <w:tcMar>
-              <w:top w:w="60" w:type="dxa"/>
-              <w:left w:w="100" w:type="dxa"/>
-              <w:bottom w:w="60" w:type="dxa"/>
-              <w:right w:w="100" w:type="dxa"/>
-            </w:tcMar>
-            <w:vAlign w:val="center"/>
-          </w:tcPr>
-          <w:p>
-            <w:pPr>
-              <w:spacing w:before="40" w:after="40" w:line="260" w:lineRule="auto"/>
-            </w:pPr>
-            <w:r>
-              <w:rPr>
-                <w:sz w:val="24"/>
-                <w:szCs w:val="24"/>
-              </w:rPr>
-              <w:t>3 ca thuận lợi, 3 ca lỗi và phục hồi, 2 ca bảo mật, 2 ca thiếu thông tin.</w:t>
-            </w:r>
-          </w:p>
-        </w:tc>
-      </w:tr>
-      <w:tr>
-        <w:tc>
-          <w:tcPr>
-            <w:tcW w:w="900" w:type="dxa"/>
-            <w:tcMar>
-              <w:top w:w="60" w:type="dxa"/>
-              <w:left w:w="100" w:type="dxa"/>
-              <w:bottom w:w="60" w:type="dxa"/>
-              <w:right w:w="100" w:type="dxa"/>
-            </w:tcMar>
-            <w:vAlign w:val="center"/>
-          </w:tcPr>
-          <w:p>
-            <w:pPr>
-              <w:spacing w:before="40" w:after="40" w:line="260" w:lineRule="auto"/>
-              <w:jc w:val="center"/>
-            </w:pPr>
-            <w:r>
-              <w:rPr>
-                <w:sz w:val="24"/>
-                <w:szCs w:val="24"/>
-              </w:rPr>
-              <w:t>9h3</w:t>
-            </w:r>
-            <w:r>
-              <w:rPr>
-                <w:sz w:val="24"/>
-                <w:szCs w:val="24"/>
-              </w:rPr>
-              <w:t>0</w:t>
-            </w:r>
-          </w:p>
-        </w:tc>
-        <w:tc>
-          <w:tcPr>
-            <w:tcW w:w="4200" w:type="dxa"/>
-            <w:tcMar>
-              <w:top w:w="60" w:type="dxa"/>
-              <w:left w:w="100" w:type="dxa"/>
-              <w:bottom w:w="60" w:type="dxa"/>
-              <w:right w:w="100" w:type="dxa"/>
-            </w:tcMar>
-            <w:vAlign w:val="center"/>
-          </w:tcPr>
-          <w:p>
-            <w:pPr>
-              <w:spacing w:before="40" w:after="40" w:line="260" w:lineRule="auto"/>
-            </w:pPr>
-            <w:r>
-              <w:rPr>
-                <w:sz w:val="24"/>
-                <w:szCs w:val="24"/>
-              </w:rPr>
-              <w:t>Ban Tổ chức bật sự cố mô phỏng: API điểm danh timeout đồng loạt.</w:t>
-            </w:r>
-          </w:p>
-        </w:tc>
-        <w:tc>
-          <w:tcPr>
-            <w:tcW w:w="4254" w:type="dxa"/>
-            <w:tcMar>
-              <w:top w:w="60" w:type="dxa"/>
-              <w:left w:w="100" w:type="dxa"/>
-              <w:bottom w:w="60" w:type="dxa"/>
-              <w:right w:w="100" w:type="dxa"/>
-            </w:tcMar>
-            <w:vAlign w:val="center"/>
-          </w:tcPr>
-          <w:p>
-            <w:pPr>
-              <w:spacing w:before="40" w:after="40" w:line="260" w:lineRule="auto"/>
-            </w:pPr>
-            <w:r>
-              <w:rPr>
-                <w:sz w:val="24"/>
-                <w:szCs w:val="24"/>
-              </w:rPr>
-              <w:t>Agent của đội chuyển cán bộ thay vì bịa số liệu.</w:t>
-            </w:r>
-          </w:p>
-        </w:tc>
-      </w:tr>
-      <w:tr>
-        <w:tc>
-          <w:tcPr>
-            <w:tcW w:w="900" w:type="dxa"/>
-            <w:tcMar>
-              <w:top w:w="60" w:type="dxa"/>
-              <w:left w:w="100" w:type="dxa"/>
-              <w:bottom w:w="60" w:type="dxa"/>
-              <w:right w:w="100" w:type="dxa"/>
-            </w:tcMar>
-            <w:vAlign w:val="center"/>
-          </w:tcPr>
-          <w:p>
-            <w:pPr>
-              <w:spacing w:before="40" w:after="40" w:line="260" w:lineRule="auto"/>
-              <w:jc w:val="center"/>
-            </w:pPr>
-            <w:r>
-              <w:rPr>
-                <w:sz w:val="24"/>
-                <w:szCs w:val="24"/>
-              </w:rPr>
-              <w:t>10h0</w:t>
-            </w:r>
-            <w:r>
-              <w:rPr>
-                <w:sz w:val="24"/>
-                <w:szCs w:val="24"/>
-              </w:rPr>
-              <w:t>0</w:t>
-            </w:r>
-          </w:p>
-        </w:tc>
-        <w:tc>
-          <w:tcPr>
-            <w:tcW w:w="4200" w:type="dxa"/>
-            <w:tcMar>
-              <w:top w:w="60" w:type="dxa"/>
-              <w:left w:w="100" w:type="dxa"/>
-              <w:bottom w:w="60" w:type="dxa"/>
-              <w:right w:w="100" w:type="dxa"/>
-            </w:tcMar>
-            <w:vAlign w:val="center"/>
-          </w:tcPr>
-          <w:p>
-            <w:pPr>
-              <w:spacing w:before="40" w:after="40" w:line="260" w:lineRule="auto"/>
-            </w:pPr>
-            <w:r>
-              <w:rPr>
-                <w:sz w:val="24"/>
-                <w:szCs w:val="24"/>
-              </w:rPr>
-              <w:t>Nộp bài và khóa mã nguồn.</w:t>
-            </w:r>
-          </w:p>
-        </w:tc>
-        <w:tc>
-          <w:tcPr>
-            <w:tcW w:w="4254" w:type="dxa"/>
-            <w:tcMar>
-              <w:top w:w="60" w:type="dxa"/>
-              <w:left w:w="100" w:type="dxa"/>
-              <w:bottom w:w="60" w:type="dxa"/>
-              <w:right w:w="100" w:type="dxa"/>
-            </w:tcMar>
-            <w:vAlign w:val="center"/>
-          </w:tcPr>
-          <w:p>
-            <w:pPr>
-              <w:spacing w:before="40" w:after="40" w:line="260" w:lineRule="auto"/>
-            </w:pPr>
-            <w:r>
-              <w:rPr>
-                <w:sz w:val="24"/>
-                <w:szCs w:val="24"/>
-              </w:rPr>
-              <w:t>Điểm công khai 91,50/100.</w:t>
-            </w:r>
-          </w:p>
-        </w:tc>
-      </w:tr>
-      <w:tr>
-        <w:tc>
-          <w:tcPr>
-            <w:tcW w:w="900" w:type="dxa"/>
-            <w:tcMar>
-              <w:top w:w="60" w:type="dxa"/>
-              <w:left w:w="100" w:type="dxa"/>
-              <w:bottom w:w="60" w:type="dxa"/>
-              <w:right w:w="100" w:type="dxa"/>
-            </w:tcMar>
-            <w:vAlign w:val="center"/>
-          </w:tcPr>
-          <w:p>
-            <w:pPr>
-              <w:spacing w:before="40" w:after="40" w:line="260" w:lineRule="auto"/>
-              <w:jc w:val="center"/>
-            </w:pPr>
-            <w:r>
-              <w:rPr>
-                <w:sz w:val="24"/>
-                <w:szCs w:val="24"/>
-              </w:rPr>
-              <w:t>10h0</w:t>
-            </w:r>
-            <w:r>
-              <w:rPr>
-                <w:sz w:val="24"/>
-                <w:szCs w:val="24"/>
-              </w:rPr>
-              <w:t>5</w:t>
-            </w:r>
-          </w:p>
-        </w:tc>
-        <w:tc>
-          <w:tcPr>
-            <w:tcW w:w="4200" w:type="dxa"/>
-            <w:tcMar>
-              <w:top w:w="60" w:type="dxa"/>
-              <w:left w:w="100" w:type="dxa"/>
-              <w:bottom w:w="60" w:type="dxa"/>
-              <w:right w:w="100" w:type="dxa"/>
-            </w:tcMar>
-            <w:vAlign w:val="center"/>
-          </w:tcPr>
-          <w:p>
-            <w:pPr>
-              <w:spacing w:before="40" w:after="40" w:line="260" w:lineRule="auto"/>
-            </w:pPr>
-            <w:r>
-              <w:rPr>
-                <w:sz w:val="24"/>
-                <w:szCs w:val="24"/>
-              </w:rPr>
-              <w:t>Engineering Review: giám khảo chỉ 02 trace bất kỳ, yêu cầu giải thích.</w:t>
-            </w:r>
-          </w:p>
-        </w:tc>
-        <w:tc>
-          <w:tcPr>
-            <w:tcW w:w="4254" w:type="dxa"/>
-            <w:tcMar>
-              <w:top w:w="60" w:type="dxa"/>
-              <w:left w:w="100" w:type="dxa"/>
-              <w:bottom w:w="60" w:type="dxa"/>
-              <w:right w:w="100" w:type="dxa"/>
-            </w:tcMar>
-            <w:vAlign w:val="center"/>
-          </w:tcPr>
-          <w:p>
-            <w:pPr>
-              <w:spacing w:before="40" w:after="40" w:line="260" w:lineRule="auto"/>
-            </w:pPr>
-            <w:r>
-              <w:rPr>
-                <w:sz w:val="24"/>
-                <w:szCs w:val="24"/>
-              </w:rPr>
-              <w:t>Cả 4 thành viên đều phải nói được mình sửa phần nào. Ngà</w:t>
-            </w:r>
-            <w:r>
-              <w:rPr>
-                <w:sz w:val="24"/>
-                <w:szCs w:val="24"/>
-              </w:rPr>
-              <w:t>y 20/10 đội biết mình lọt Top 15</w:t>
-            </w:r>
-            <w:r>
-              <w:rPr>
-                <w:sz w:val="24"/>
-                <w:szCs w:val="24"/>
-              </w:rPr>
-              <w:t>.</w:t>
+              <w:t xml:space="preserve">Slides trình bày + demo nếu có </w:t>
             </w:r>
           </w:p>
         </w:tc>
@@ -4074,69 +3290,6 @@
         <w:jc w:val="both"/>
       </w:pPr>
     </w:p>
-    <w:tbl>
-      <w:tblPr>
-        <w:tblW w:w="9354" w:type="dxa"/>
-        <w:tblBorders>
-          <w:top w:val="single" w:sz="4" w:space="0" w:color="auto"/>
-          <w:left w:val="single" w:sz="4" w:space="0" w:color="auto"/>
-          <w:bottom w:val="single" w:sz="4" w:space="0" w:color="auto"/>
-          <w:right w:val="single" w:sz="4" w:space="0" w:color="auto"/>
-          <w:insideH w:val="single" w:sz="4" w:space="0" w:color="auto"/>
-          <w:insideV w:val="single" w:sz="4" w:space="0" w:color="auto"/>
-        </w:tblBorders>
-        <w:tblCellMar>
-          <w:left w:w="10" w:type="dxa"/>
-          <w:right w:w="10" w:type="dxa"/>
-        </w:tblCellMar>
-        <w:tblLook w:val="0000" w:firstRow="0" w:lastRow="0" w:firstColumn="0" w:lastColumn="0" w:noHBand="0" w:noVBand="0"/>
-      </w:tblPr>
-      <w:tblGrid>
-        <w:gridCol w:w="9354"/>
-      </w:tblGrid>
-      <w:tr>
-        <w:tc>
-          <w:tcPr>
-            <w:tcW w:w="9354" w:type="dxa"/>
-            <w:shd w:val="clear" w:color="auto" w:fill="FFF2CC"/>
-            <w:tcMar>
-              <w:top w:w="120" w:type="dxa"/>
-              <w:left w:w="160" w:type="dxa"/>
-              <w:bottom w:w="120" w:type="dxa"/>
-              <w:right w:w="160" w:type="dxa"/>
-            </w:tcMar>
-          </w:tcPr>
-          <w:p>
-            <w:pPr>
-              <w:spacing w:after="80" w:line="276" w:lineRule="auto"/>
-              <w:jc w:val="both"/>
-            </w:pPr>
-            <w:r>
-              <w:rPr>
-                <w:b/>
-                <w:bCs/>
-                <w:sz w:val="24"/>
-                <w:szCs w:val="24"/>
-              </w:rPr>
-              <w:t>Vì sao điểm ẩn thấp hơn điểm công khai</w:t>
-            </w:r>
-          </w:p>
-          <w:p>
-            <w:pPr>
-              <w:spacing w:line="276" w:lineRule="auto"/>
-              <w:jc w:val="both"/>
-            </w:pPr>
-            <w:r>
-              <w:rPr>
-                <w:sz w:val="24"/>
-                <w:szCs w:val="24"/>
-              </w:rPr>
-              <w:t>Điểm chính thức không chấm bằng bộ kiểm thử em nhìn thấy. Ban Tổ chức chấm bằng một bộ khác, cùng logic nhưng đổi cách diễn đạt, đổi mã môn học và đổi mã sinh viên. Vì vậy cách viết “nếu mã ca thi là P-ATT-01 thì trả lời không đủ điều kiện” sẽ đạt điểm cao ở bản công khai và bằng 0 ở bản chấm thật.</w:t>
-            </w:r>
-          </w:p>
-        </w:tc>
-      </w:tr>
-    </w:tbl>
     <w:p>
       <w:pPr>
         <w:spacing w:before="200" w:after="100" w:line="276" w:lineRule="auto"/>
@@ -4230,6 +3383,7 @@
           <w:b/>
           <w:bCs/>
         </w:rPr>
+        <w:lastRenderedPageBreak/>
         <w:t>Chặng 5 (thứ Bảy 31</w:t>
       </w:r>
       <w:r>
@@ -4309,7 +3463,6 @@
                 <w:sz w:val="24"/>
                 <w:szCs w:val="24"/>
               </w:rPr>
-              <w:lastRenderedPageBreak/>
               <w:t>Khung giờ</w:t>
             </w:r>
           </w:p>
@@ -5179,6 +4332,7 @@
         <w:jc w:val="both"/>
       </w:pPr>
       <w:r>
+        <w:lastRenderedPageBreak/>
         <w:t>Được. Vòng Kỹ thuật không yêu cầu huấn luyện mô hình. Em nhận một chương trình đã chạy được và sửa nó, giống như sửa bug trong một dự án phần mềm bình thường. Ba buổi training đủ để bắt đầu.</w:t>
       </w:r>
     </w:p>
@@ -5201,7 +4355,6 @@
         <w:jc w:val="both"/>
       </w:pPr>
       <w:r>
-        <w:lastRenderedPageBreak/>
         <w:t>Kinh nghiệm hợp lý: chuẩn bị dữ liệu, khung dự án và các công cụ cơ bản; cố tình để lại cho ngày thi những phần có thể làm trong 05 giờ như ràng buộc an toàn, bộ ca kiểm thử và phần triển khai. Chuẩn bị quá nhiều thì mất điểm thi tại chỗ, chuẩn bị quá ít thì không kịp.</w:t>
       </w:r>
     </w:p>
@@ -5400,16 +4553,7 @@
                 <w:sz w:val="24"/>
                 <w:szCs w:val="24"/>
               </w:rPr>
-              <w:t>Một Agent nói hay mà làm sai thì nguy hiểm hơn một Agent không nói gì. Việc của em không phải là làm cho A</w:t>
-            </w:r>
-            <w:bookmarkStart w:id="0" w:name="_GoBack"/>
-            <w:bookmarkEnd w:id="0"/>
-            <w:r>
-              <w:rPr>
-                <w:sz w:val="24"/>
-                <w:szCs w:val="24"/>
-              </w:rPr>
-              <w:t>I trả lời trôi chảy, mà là làm cho nó chỉ dám khẳng định những điều nó đã kiểm chứng được.</w:t>
+              <w:t>Một Agent nói hay mà làm sai thì nguy hiểm hơn một Agent không nói gì. Việc của em không phải là làm cho AI trả lời trôi chảy, mà là làm cho nó chỉ dám khẳng định những điều nó đã kiểm chứng được.</w:t>
             </w:r>
           </w:p>
         </w:tc>

</xml_diff>